<commit_message>
docs: reconcile final acceptance and refresh delivery documents
</commit_message>
<xml_diff>
--- a/docs/delivery/FINAL_REPORT_2026-10-21.docx
+++ b/docs/delivery/FINAL_REPORT_2026-10-21.docx
@@ -2,6 +2,1159 @@
 <file path=word/document.xml><?xml version="1.0" encoding="utf-8"?>
 <w:document xmlns:wpc="http://schemas.microsoft.com/office/word/2010/wordprocessingCanvas" xmlns:mo="http://schemas.microsoft.com/office/mac/office/2008/main" xmlns:mc="http://schemas.openxmlformats.org/markup-compatibility/2006" xmlns:mv="urn:schemas-microsoft-com:mac:vml" xmlns:o="urn:schemas-microsoft-com:office:office" xmlns:r="http://schemas.openxmlformats.org/officeDocument/2006/relationships" xmlns:m="http://schemas.openxmlformats.org/officeDocument/2006/math" xmlns:v="urn:schemas-microsoft-com:vml" xmlns:wp14="http://schemas.microsoft.com/office/word/2010/wordprocessingDrawing" xmlns:wp="http://schemas.openxmlformats.org/drawingml/2006/wordprocessingDrawing" xmlns:w10="urn:schemas-microsoft-com:office:word" xmlns:w="http://schemas.openxmlformats.org/wordprocessingml/2006/main" xmlns:w14="http://schemas.microsoft.com/office/word/2010/wordml" xmlns:wpg="http://schemas.microsoft.com/office/word/2010/wordprocessingGroup" xmlns:wpi="http://schemas.microsoft.com/office/word/2010/wordprocessingInk" xmlns:wne="http://schemas.microsoft.com/office/word/2006/wordml" xmlns:wps="http://schemas.microsoft.com/office/word/2010/wordprocessingShape" mc:Ignorable="w14 wp14">
   <w:body>
+    <w:p>
+      <w:pPr>
+        <w:pStyle w:val="Heading1"/>
+      </w:pPr>
+      <w:r>
+        <w:t>Текущий статус и сверка плана — 21 октября 2026</w:t>
+      </w:r>
+    </w:p>
+    <w:p>
+      <w:r>
+        <w:t>Прикладная версия: c4bca3c (регистрация/восстановление — aaa7164). Ветка codex/fsp-mvp. Банк 2.1.1, подбор matching-1.2.0. Стенд: https://85-137-26-131.sslip.io/ . Этот документ описывает текущий итог; прежние протоколы сохраняют свои даты и результаты.</w:t>
+      </w:r>
+    </w:p>
+    <w:p>
+      <w:r>
+        <w:t>Абсолютно весь исходный список не закрыт. Технические задачи Q1–Q7 и исправления, согласованные по ручному проходу, выполнены. Публикация актуальной истории отложена пользователем, ссылки организаторам не отправлены. Независимый пилот качества грейдов/подбора не проводился. Это разные виды завершения, их нельзя объединять в «100%».</w:t>
+      </w:r>
+    </w:p>
+    <w:p>
+      <w:pPr>
+        <w:pStyle w:val="Heading2"/>
+      </w:pPr>
+      <w:r>
+        <w:t>Сверка с утренним планом</w:t>
+      </w:r>
+    </w:p>
+    <w:p>
+      <w:r>
+        <w:t>Источник: комплексное задание (../final_backlog_2026-10-20/COMPREHENSIVE_STAGE_A_2026-10-21.md), машиночитаемый backlog (../final_backlog_2026-10-20/BACKLOG_STAGE_A.json). Пользовательские изменения исходного задания сохранены.</w:t>
+      </w:r>
+    </w:p>
+    <w:tbl>
+      <w:tblPr>
+        <w:tblStyle w:val="LightShading-Accent1"/>
+        <w:tblW w:type="auto" w:w="0"/>
+        <w:tblLayout w:type="fixed"/>
+        <w:tblLook w:firstColumn="1" w:firstRow="1" w:lastColumn="0" w:lastRow="0" w:noHBand="0" w:noVBand="1" w:val="04A0"/>
+      </w:tblPr>
+      <w:tblGrid>
+        <w:gridCol w:w="1636"/>
+        <w:gridCol w:w="4431"/>
+        <w:gridCol w:w="2573"/>
+      </w:tblGrid>
+      <w:tr>
+        <w:trPr>
+          <w:cantSplit/>
+          <w:tblHeader/>
+        </w:trPr>
+        <w:tc>
+          <w:tcPr>
+            <w:tcW w:type="dxa" w:w="1636"/>
+          </w:tcPr>
+          <w:p>
+            <w:r>
+              <w:rPr>
+                <w:sz w:val="18"/>
+              </w:rPr>
+              <w:t>Пункт</w:t>
+            </w:r>
+          </w:p>
+        </w:tc>
+        <w:tc>
+          <w:tcPr>
+            <w:tcW w:type="dxa" w:w="4431"/>
+          </w:tcPr>
+          <w:p>
+            <w:r>
+              <w:rPr>
+                <w:sz w:val="18"/>
+              </w:rPr>
+              <w:t>Текущий статус</w:t>
+            </w:r>
+          </w:p>
+        </w:tc>
+        <w:tc>
+          <w:tcPr>
+            <w:tcW w:type="dxa" w:w="2573"/>
+          </w:tcPr>
+          <w:p>
+            <w:r>
+              <w:rPr>
+                <w:sz w:val="18"/>
+              </w:rPr>
+              <w:t>Основание / остаток</w:t>
+            </w:r>
+          </w:p>
+        </w:tc>
+      </w:tr>
+      <w:tr>
+        <w:trPr>
+          <w:cantSplit/>
+        </w:trPr>
+        <w:tc>
+          <w:tcPr>
+            <w:tcW w:type="dxa" w:w="1636"/>
+          </w:tcPr>
+          <w:p>
+            <w:r>
+              <w:rPr>
+                <w:sz w:val="18"/>
+              </w:rPr>
+              <w:t>Q1 — черновики</w:t>
+            </w:r>
+          </w:p>
+        </w:tc>
+        <w:tc>
+          <w:tcPr>
+            <w:tcW w:type="dxa" w:w="4431"/>
+          </w:tcPr>
+          <w:p>
+            <w:r>
+              <w:rPr>
+                <w:sz w:val="18"/>
+              </w:rPr>
+              <w:t>Выполнено</w:t>
+            </w:r>
+          </w:p>
+        </w:tc>
+        <w:tc>
+          <w:tcPr>
+            <w:tcW w:type="dxa" w:w="2573"/>
+          </w:tcPr>
+          <w:p>
+            <w:r>
+              <w:rPr>
+                <w:sz w:val="18"/>
+              </w:rPr>
+              <w:t>Серверное сохранение, локальная очередь при сбое, предупреждения; ручной маршрут и отрицательные автопроверки</w:t>
+            </w:r>
+          </w:p>
+        </w:tc>
+      </w:tr>
+      <w:tr>
+        <w:trPr>
+          <w:cantSplit/>
+        </w:trPr>
+        <w:tc>
+          <w:tcPr>
+            <w:tcW w:type="dxa" w:w="1636"/>
+          </w:tcPr>
+          <w:p>
+            <w:r>
+              <w:rPr>
+                <w:sz w:val="18"/>
+              </w:rPr>
+              <w:t>Q2 — округление</w:t>
+            </w:r>
+          </w:p>
+        </w:tc>
+        <w:tc>
+          <w:tcPr>
+            <w:tcW w:type="dxa" w:w="4431"/>
+          </w:tcPr>
+          <w:p>
+            <w:r>
+              <w:rPr>
+                <w:sz w:val="18"/>
+              </w:rPr>
+              <w:t>Выполнено</w:t>
+            </w:r>
+          </w:p>
+        </w:tc>
+        <w:tc>
+          <w:tcPr>
+            <w:tcW w:type="dxa" w:w="2573"/>
+          </w:tcPr>
+          <w:p>
+            <w:r>
+              <w:rPr>
+                <w:sz w:val="18"/>
+              </w:rPr>
+              <w:t>Half-up с явной подсказкой, точка/запятая; старые оценки сохранены по решению пользователя</w:t>
+            </w:r>
+          </w:p>
+        </w:tc>
+      </w:tr>
+      <w:tr>
+        <w:trPr>
+          <w:cantSplit/>
+        </w:trPr>
+        <w:tc>
+          <w:tcPr>
+            <w:tcW w:type="dxa" w:w="1636"/>
+          </w:tcPr>
+          <w:p>
+            <w:r>
+              <w:rPr>
+                <w:sz w:val="18"/>
+              </w:rPr>
+              <w:t>Q3 — пропуски</w:t>
+            </w:r>
+          </w:p>
+        </w:tc>
+        <w:tc>
+          <w:tcPr>
+            <w:tcW w:type="dxa" w:w="4431"/>
+          </w:tcPr>
+          <w:p>
+            <w:r>
+              <w:rPr>
+                <w:sz w:val="18"/>
+              </w:rPr>
+              <w:t>Выполнено</w:t>
+            </w:r>
+          </w:p>
+        </w:tc>
+        <w:tc>
+          <w:tcPr>
+            <w:tcW w:type="dxa" w:w="2573"/>
+          </w:tcPr>
+          <w:p>
+            <w:r>
+              <w:rPr>
+                <w:sz w:val="18"/>
+              </w:rPr>
+              <w:t>Отмена сохраняет попытку; UI и API требуют подтверждения неполной сдачи</w:t>
+            </w:r>
+          </w:p>
+        </w:tc>
+      </w:tr>
+      <w:tr>
+        <w:trPr>
+          <w:cantSplit/>
+        </w:trPr>
+        <w:tc>
+          <w:tcPr>
+            <w:tcW w:type="dxa" w:w="1636"/>
+          </w:tcPr>
+          <w:p>
+            <w:r>
+              <w:rPr>
+                <w:sz w:val="18"/>
+              </w:rPr>
+              <w:t>Q4 — состояния и доступ</w:t>
+            </w:r>
+          </w:p>
+        </w:tc>
+        <w:tc>
+          <w:tcPr>
+            <w:tcW w:type="dxa" w:w="4431"/>
+          </w:tcPr>
+          <w:p>
+            <w:r>
+              <w:rPr>
+                <w:sz w:val="18"/>
+              </w:rPr>
+              <w:t>Выполнено в проверенных сценариях</w:t>
+            </w:r>
+          </w:p>
+        </w:tc>
+        <w:tc>
+          <w:tcPr>
+            <w:tcW w:type="dxa" w:w="2573"/>
+          </w:tcPr>
+          <w:p>
+            <w:r>
+              <w:rPr>
+                <w:sz w:val="18"/>
+              </w:rPr>
+              <w:t>Скрытие, отзыв, новая выдача согласия, закрытие чата/PDF; карточки обновляют контакты без F5</w:t>
+            </w:r>
+          </w:p>
+        </w:tc>
+      </w:tr>
+      <w:tr>
+        <w:trPr>
+          <w:cantSplit/>
+        </w:trPr>
+        <w:tc>
+          <w:tcPr>
+            <w:tcW w:type="dxa" w:w="1636"/>
+          </w:tcPr>
+          <w:p>
+            <w:r>
+              <w:rPr>
+                <w:sz w:val="18"/>
+              </w:rPr>
+              <w:t>Q5 — подбор и объяснения</w:t>
+            </w:r>
+          </w:p>
+        </w:tc>
+        <w:tc>
+          <w:tcPr>
+            <w:tcW w:type="dxa" w:w="4431"/>
+          </w:tcPr>
+          <w:p>
+            <w:r>
+              <w:rPr>
+                <w:sz w:val="18"/>
+              </w:rPr>
+              <w:t>Выполнено</w:t>
+            </w:r>
+          </w:p>
+        </w:tc>
+        <w:tc>
+          <w:tcPr>
+            <w:tcW w:type="dxa" w:w="2573"/>
+          </w:tcPr>
+          <w:p>
+            <w:r>
+              <w:rPr>
+                <w:sz w:val="18"/>
+              </w:rPr>
+              <w:t>Анонимные обозначения, фильтры, снимки, вклады; порядок UI совпадает с API</w:t>
+            </w:r>
+          </w:p>
+        </w:tc>
+      </w:tr>
+      <w:tr>
+        <w:trPr>
+          <w:cantSplit/>
+        </w:trPr>
+        <w:tc>
+          <w:tcPr>
+            <w:tcW w:type="dxa" w:w="1636"/>
+          </w:tcPr>
+          <w:p>
+            <w:r>
+              <w:rPr>
+                <w:sz w:val="18"/>
+              </w:rPr>
+              <w:t>Q6 — расписание</w:t>
+            </w:r>
+          </w:p>
+        </w:tc>
+        <w:tc>
+          <w:tcPr>
+            <w:tcW w:type="dxa" w:w="4431"/>
+          </w:tcPr>
+          <w:p>
+            <w:r>
+              <w:rPr>
+                <w:sz w:val="18"/>
+              </w:rPr>
+              <w:t>Техническая проверка выполнена</w:t>
+            </w:r>
+          </w:p>
+        </w:tc>
+        <w:tc>
+          <w:tcPr>
+            <w:tcW w:type="dxa" w:w="2573"/>
+          </w:tcPr>
+          <w:p>
+            <w:r>
+              <w:rPr>
+                <w:sz w:val="18"/>
+              </w:rPr>
+              <w:t>Пауза/возобновление без раннего дубля; границы проверены управляемым временем. Реальную неделю не ждали</w:t>
+            </w:r>
+          </w:p>
+        </w:tc>
+      </w:tr>
+      <w:tr>
+        <w:trPr>
+          <w:cantSplit/>
+        </w:trPr>
+        <w:tc>
+          <w:tcPr>
+            <w:tcW w:type="dxa" w:w="1636"/>
+          </w:tcPr>
+          <w:p>
+            <w:r>
+              <w:rPr>
+                <w:sz w:val="18"/>
+              </w:rPr>
+              <w:t>Q7 — веса и проверка</w:t>
+            </w:r>
+          </w:p>
+        </w:tc>
+        <w:tc>
+          <w:tcPr>
+            <w:tcW w:type="dxa" w:w="4431"/>
+          </w:tcPr>
+          <w:p>
+            <w:r>
+              <w:rPr>
+                <w:sz w:val="18"/>
+              </w:rPr>
+              <w:t>Инженерный DoD выполнен</w:t>
+            </w:r>
+          </w:p>
+        </w:tc>
+        <w:tc>
+          <w:tcPr>
+            <w:tcW w:type="dxa" w:w="2573"/>
+          </w:tcPr>
+          <w:p>
+            <w:r>
+              <w:rPr>
+                <w:sz w:val="18"/>
+              </w:rPr>
+              <w:t>Выбор 30/15/45/10 на dev, версия 1.2.0; holdout P@5 0,80 → 0,80. Рост качества не доказан</w:t>
+            </w:r>
+          </w:p>
+        </w:tc>
+      </w:tr>
+      <w:tr>
+        <w:trPr>
+          <w:cantSplit/>
+        </w:trPr>
+        <w:tc>
+          <w:tcPr>
+            <w:tcW w:type="dxa" w:w="1636"/>
+          </w:tcPr>
+          <w:p>
+            <w:r>
+              <w:rPr>
+                <w:sz w:val="18"/>
+              </w:rPr>
+              <w:t>Pck1 — changelog</w:t>
+            </w:r>
+          </w:p>
+        </w:tc>
+        <w:tc>
+          <w:tcPr>
+            <w:tcW w:type="dxa" w:w="4431"/>
+          </w:tcPr>
+          <w:p>
+            <w:r>
+              <w:rPr>
+                <w:sz w:val="18"/>
+              </w:rPr>
+              <w:t>Подготовлен и актуализирован</w:t>
+            </w:r>
+          </w:p>
+        </w:tc>
+        <w:tc>
+          <w:tcPr>
+            <w:tcW w:type="dxa" w:w="2573"/>
+          </w:tcPr>
+          <w:p>
+            <w:r>
+              <w:rPr>
+                <w:sz w:val="18"/>
+              </w:rPr>
+              <w:t>Изменения и границы описаны</w:t>
+            </w:r>
+          </w:p>
+        </w:tc>
+      </w:tr>
+      <w:tr>
+        <w:trPr>
+          <w:cantSplit/>
+        </w:trPr>
+        <w:tc>
+          <w:tcPr>
+            <w:tcW w:type="dxa" w:w="1636"/>
+          </w:tcPr>
+          <w:p>
+            <w:r>
+              <w:rPr>
+                <w:sz w:val="18"/>
+              </w:rPr>
+              <w:t>Pck2 — README / for-jury</w:t>
+            </w:r>
+          </w:p>
+        </w:tc>
+        <w:tc>
+          <w:tcPr>
+            <w:tcW w:type="dxa" w:w="4431"/>
+          </w:tcPr>
+          <w:p>
+            <w:r>
+              <w:rPr>
+                <w:sz w:val="18"/>
+              </w:rPr>
+              <w:t>Локальный комплект готов; частично до публикации</w:t>
+            </w:r>
+          </w:p>
+        </w:tc>
+        <w:tc>
+          <w:tcPr>
+            <w:tcW w:type="dxa" w:w="2573"/>
+          </w:tcPr>
+          <w:p>
+            <w:r>
+              <w:rPr>
+                <w:sz w:val="18"/>
+              </w:rPr>
+              <w:t>Актуальные GitHub-ссылки и самостоятельный маршрут жюри после публикации ещё не подтверждены</w:t>
+            </w:r>
+          </w:p>
+        </w:tc>
+      </w:tr>
+      <w:tr>
+        <w:trPr>
+          <w:cantSplit/>
+        </w:trPr>
+        <w:tc>
+          <w:tcPr>
+            <w:tcW w:type="dxa" w:w="1636"/>
+          </w:tcPr>
+          <w:p>
+            <w:r>
+              <w:rPr>
+                <w:sz w:val="18"/>
+              </w:rPr>
+              <w:t>Pck3 — деплой</w:t>
+            </w:r>
+          </w:p>
+        </w:tc>
+        <w:tc>
+          <w:tcPr>
+            <w:tcW w:type="dxa" w:w="4431"/>
+          </w:tcPr>
+          <w:p>
+            <w:r>
+              <w:rPr>
+                <w:sz w:val="18"/>
+              </w:rPr>
+              <w:t>Выполнено</w:t>
+            </w:r>
+          </w:p>
+        </w:tc>
+        <w:tc>
+          <w:tcPr>
+            <w:tcW w:type="dxa" w:w="2573"/>
+          </w:tcPr>
+          <w:p>
+            <w:r>
+              <w:rPr>
+                <w:sz w:val="18"/>
+              </w:rPr>
+              <w:t>Обновлены api/web/task-worker; HTTPS и новая форма проверены</w:t>
+            </w:r>
+          </w:p>
+        </w:tc>
+      </w:tr>
+      <w:tr>
+        <w:trPr>
+          <w:cantSplit/>
+        </w:trPr>
+        <w:tc>
+          <w:tcPr>
+            <w:tcW w:type="dxa" w:w="1636"/>
+          </w:tcPr>
+          <w:p>
+            <w:r>
+              <w:rPr>
+                <w:sz w:val="18"/>
+              </w:rPr>
+              <w:t>Pck4 — smoke</w:t>
+            </w:r>
+          </w:p>
+        </w:tc>
+        <w:tc>
+          <w:tcPr>
+            <w:tcW w:type="dxa" w:w="4431"/>
+          </w:tcPr>
+          <w:p>
+            <w:r>
+              <w:rPr>
+                <w:sz w:val="18"/>
+              </w:rPr>
+              <w:t>Выполнено</w:t>
+            </w:r>
+          </w:p>
+        </w:tc>
+        <w:tc>
+          <w:tcPr>
+            <w:tcW w:type="dxa" w:w="2573"/>
+          </w:tcPr>
+          <w:p>
+            <w:r>
+              <w:rPr>
+                <w:sz w:val="18"/>
+              </w:rPr>
+              <w:t>Последний живой прогон: 24 группы PASS</w:t>
+            </w:r>
+          </w:p>
+        </w:tc>
+      </w:tr>
+      <w:tr>
+        <w:trPr>
+          <w:cantSplit/>
+        </w:trPr>
+        <w:tc>
+          <w:tcPr>
+            <w:tcW w:type="dxa" w:w="1636"/>
+          </w:tcPr>
+          <w:p>
+            <w:r>
+              <w:rPr>
+                <w:sz w:val="18"/>
+              </w:rPr>
+              <w:t>Pck5 — отправка</w:t>
+            </w:r>
+          </w:p>
+        </w:tc>
+        <w:tc>
+          <w:tcPr>
+            <w:tcW w:type="dxa" w:w="4431"/>
+          </w:tcPr>
+          <w:p>
+            <w:r>
+              <w:rPr>
+                <w:sz w:val="18"/>
+              </w:rPr>
+              <w:t>Не выполнено</w:t>
+            </w:r>
+          </w:p>
+        </w:tc>
+        <w:tc>
+          <w:tcPr>
+            <w:tcW w:type="dxa" w:w="2573"/>
+          </w:tcPr>
+          <w:p>
+            <w:r>
+              <w:rPr>
+                <w:sz w:val="18"/>
+              </w:rPr>
+              <w:t>Только после разрешения на публикацию и проверки ссылок; внешних сообщений агент не отправлял</w:t>
+            </w:r>
+          </w:p>
+        </w:tc>
+      </w:tr>
+      <w:tr>
+        <w:trPr>
+          <w:cantSplit/>
+        </w:trPr>
+        <w:tc>
+          <w:tcPr>
+            <w:tcW w:type="dxa" w:w="1636"/>
+          </w:tcPr>
+          <w:p>
+            <w:r>
+              <w:rPr>
+                <w:sz w:val="18"/>
+              </w:rPr>
+              <w:t>Этап B — питч</w:t>
+            </w:r>
+          </w:p>
+        </w:tc>
+        <w:tc>
+          <w:tcPr>
+            <w:tcW w:type="dxa" w:w="4431"/>
+          </w:tcPr>
+          <w:p>
+            <w:r>
+              <w:rPr>
+                <w:sz w:val="18"/>
+              </w:rPr>
+              <w:t>Сценарий и материалы подготовлены</w:t>
+            </w:r>
+          </w:p>
+        </w:tc>
+        <w:tc>
+          <w:tcPr>
+            <w:tcW w:type="dxa" w:w="2573"/>
+          </w:tcPr>
+          <w:p>
+            <w:r>
+              <w:rPr>
+                <w:sz w:val="18"/>
+              </w:rPr>
+              <w:t>Регламент, репетиция и выступление не подтверждены</w:t>
+            </w:r>
+          </w:p>
+        </w:tc>
+      </w:tr>
+    </w:tbl>
+    <w:p>
+      <w:pPr>
+        <w:pStyle w:val="Heading2"/>
+      </w:pPr>
+      <w:r>
+        <w:t>Дополнительные замечания</w:t>
+      </w:r>
+    </w:p>
+    <w:p>
+      <w:r>
+        <w:t>B01–B09 и U01–U07 разобраны в аудите (FINAL_AUDIT_2026-10-21.md), новые замечания — в ручной приёмке (HUMAN_ACCEPTANCE_2026-10-21.md). Исправлены ноль в числовых полях, мобильные отступы, регистрация с повтором и показом пароля, восстановление, повторное письмо и заметность ошибок. Пользователь после выкладки сообщил «всё идеально работает»; последняя просьба убрать фразу про менеджер паролей выполнена отдельно. Это общее подтверждение работы, а не поимённая подпись под каждым негативным почтовым сценарием.</w:t>
+      </w:r>
+    </w:p>
+    <w:p>
+      <w:r>
+        <w:t>Для U06 дополнительный обратный отсчёт не реализован: есть точная дата. Полный редакционный пересмотр каждой строки не заявляется. Известное ограничение чата — повтор после потери уже записанного ответа может дать дубль — остаётся в эксплуатационном backlog. По ручной проверке одинаковые сообщения пользователь отправлял сам.</w:t>
+      </w:r>
+    </w:p>
+    <w:p>
+      <w:r>
+        <w:t>M01/M02 из финального аудита — исследование подбора/грейдов — выполнены в синтетической части, без независимых человеческих меток. Эти обозначения не следует путать с M01/M02 исходной матрицы ТЗ (регистрация и профиль).</w:t>
+      </w:r>
+    </w:p>
+    <w:p>
+      <w:pPr>
+        <w:pStyle w:val="Heading2"/>
+      </w:pPr>
+      <w:r>
+        <w:t>Актуальные доказательства</w:t>
+      </w:r>
+    </w:p>
+    <w:p>
+      <w:r>
+        <w:t>- 119 серверных тестов PASS на aaa7164; одно предупреждение тестовой зависимости. Последующая правка c4bca3c меняет только текст подсказки, сборка и опубликованный текст проверены.</w:t>
+      </w:r>
+    </w:p>
+    <w:p>
+      <w:r>
+        <w:t>- 8 проверок регистрации/восстановления в изолированном Chromium/API/PostgreSQL; SMTP в памяти. Результат (evidence/human_followup_2026-10-21/auth-browser.json).</w:t>
+      </w:r>
+    </w:p>
+    <w:p>
+      <w:r>
+        <w:t>- 24 группы живого HTTPS smoke, ошибок JavaScript нет. Результат (evidence/human_followup_2026-10-21/live-smoke.json).</w:t>
+      </w:r>
+    </w:p>
+    <w:p>
+      <w:r>
+        <w:t>- Реальная SMTP-доставка/подтверждение/вход проверены ранее; после переделки пользователь подтвердил общую работоспособность. Причина прежнего отсутствия письма на втором адресе не установлена.</w:t>
+      </w:r>
+    </w:p>
+    <w:p>
+      <w:r>
+        <w:t>- Ручной проход по скриншотам: настольный Chrome/Ubuntu и Android, сопровождался подсказками в переписке. Это не измеренный самостоятельный проход эксперта за 10–15 минут и не независимый бизнес-пилот.</w:t>
+      </w:r>
+    </w:p>
+    <w:p>
+      <w:r>
+        <w:t>- OpenAPI: 37 операций, 49 схем. В модели 17 таблиц, последняя миграция c6a10321d001.</w:t>
+      </w:r>
+    </w:p>
+    <w:p>
+      <w:pPr>
+        <w:pStyle w:val="Heading2"/>
+      </w:pPr>
+      <w:r>
+        <w:t>Остаток</w:t>
+      </w:r>
+    </w:p>
+    <w:p>
+      <w:r>
+        <w:t>Единый TODO (REMAINING_AFTER_FINAL_AUDIT_2026-10-21.md). До разрешения пользователя push не выполнять. В этой синхронизации документов приложение и данные не менялись; новые прогоны функциональных тестов не заявляются.</w:t>
+      </w:r>
+    </w:p>
+    <w:p>
+      <w:r>
+        <w:br w:type="page"/>
+      </w:r>
+    </w:p>
+    <w:p>
+      <w:pPr>
+        <w:pStyle w:val="Heading1"/>
+      </w:pPr>
+      <w:r>
+        <w:t>Ручная приёмка и исправления регистрации — 21 октября 2026</w:t>
+      </w:r>
+    </w:p>
+    <w:p>
+      <w:r>
+        <w:t>Основание: сообщения и скриншоты пользователя примерно 15:38–16:34 МСК. Проверялось на настольном Chrome/Ubuntu и физическом Android. Это внутренняя приёмка, не независимый бизнес-пилот. Скриншоты пользователя находятся в переписке; файлы в evidence/human_followup_2026-10-21 — отдельные автоматические проверки с вымышленными данными.</w:t>
+      </w:r>
+    </w:p>
+    <w:p>
+      <w:pPr>
+        <w:pStyle w:val="Heading2"/>
+      </w:pPr>
+      <w:r>
+        <w:t>Подтверждено человеком</w:t>
+      </w:r>
+    </w:p>
+    <w:p>
+      <w:r>
+        <w:t>- Черновик ответов сохранялся после переходов/перезагрузки, при отключении сети показывал ошибку и предупреждение об уходе; после восстановления сети ответ сохранился. Отмена завершения с пропусками сохраняла попытку; намеренная сдача неверного ответа и пропусков дала 0/8. Ограничение повторного Junior показано до начала, до следующего дня от времени старта.</w:t>
+      </w:r>
+    </w:p>
+    <w:p>
+      <w:r>
+        <w:t>- SQL Middle: 16,67 и 60.34 приняты правильно, общий результат со слов пользователя — 25%. Правило половинного округления написано явно. Сам случай 90.625 в ручной выборке не выпал.</w:t>
+      </w:r>
+    </w:p>
+    <w:p>
+      <w:r>
+        <w:t>- Анонимный кандидат, подтверждения Python/тестирования, версия и даты, PDF до согласия без контактов. Приглашение с диапазоном 200–250 тыс. дошло; обратный диапазон блокировался. После принятия контакты доступны пригласившей компании, другая компания получает закрытый PDF.</w:t>
+      </w:r>
+    </w:p>
+    <w:p>
+      <w:r>
+        <w:t>- Двусторонний чат, отклонение пустого сообщения, мобильный ввод. Одинаковые сообщения отправлены пользователем намеренно, это не доказательство дублирования.</w:t>
+      </w:r>
+    </w:p>
+    <w:p>
+      <w:r>
+        <w:t>- Задание: согласие, ответ, оценка 85, комментарий, пауза и возобновление. Одна завершённая выдача, следующая через 7 дней. Грейд Junior не изменился. Достижение ФСП добавилось без изменения грейда.</w:t>
+      </w:r>
+    </w:p>
+    <w:p>
+      <w:r>
+        <w:t>- Подбор: 96 = 45 + 45 + 6; после добавления обязательного HTTP/API — 81 = 30 + 45 + 6, unknown и предупреждение о неполном соответствии. Изменённые фильтры не подменяют сохранённую подборку; предыдущий результат восстанавливается. Сохранение фильтров именно после F5 отдельно не подтверждено человеком.</w:t>
+      </w:r>
+    </w:p>
+    <w:p>
+      <w:r>
+        <w:t>- Отзыв доступа закрывал чат; после F5 контакты исчезли, кандидат отсутствовал в выдаче. Повторная публикация не возобновляла старое согласие; новое приглашение и принятие восстановили общение.</w:t>
+      </w:r>
+    </w:p>
+    <w:p>
+      <w:r>
+        <w:t>- Телефон: меню, вход, приглашения, клавиатура и отправка сообщений работают. Пользователь отметил тесные отступы.</w:t>
+      </w:r>
+    </w:p>
+    <w:p>
+      <w:pPr>
+        <w:pStyle w:val="Heading2"/>
+      </w:pPr>
+      <w:r>
+        <w:t>Найдено и исправлено</w:t>
+      </w:r>
+    </w:p>
+    <w:tbl>
+      <w:tblPr>
+        <w:tblStyle w:val="LightShading-Accent1"/>
+        <w:tblW w:type="auto" w:w="0"/>
+        <w:tblLayout w:type="fixed"/>
+        <w:tblLook w:firstColumn="1" w:firstRow="1" w:lastColumn="0" w:lastRow="0" w:noHBand="0" w:noVBand="1" w:val="04A0"/>
+      </w:tblPr>
+      <w:tblGrid>
+        <w:gridCol w:w="4320"/>
+        <w:gridCol w:w="4320"/>
+      </w:tblGrid>
+      <w:tr>
+        <w:trPr>
+          <w:cantSplit/>
+          <w:tblHeader/>
+        </w:trPr>
+        <w:tc>
+          <w:tcPr>
+            <w:tcW w:type="dxa" w:w="4320"/>
+          </w:tcPr>
+          <w:p>
+            <w:r>
+              <w:rPr>
+                <w:sz w:val="18"/>
+              </w:rPr>
+              <w:t>Наблюдение</w:t>
+            </w:r>
+          </w:p>
+        </w:tc>
+        <w:tc>
+          <w:tcPr>
+            <w:tcW w:type="dxa" w:w="4320"/>
+          </w:tcPr>
+          <w:p>
+            <w:r>
+              <w:rPr>
+                <w:sz w:val="18"/>
+              </w:rPr>
+              <w:t>Изменение</w:t>
+            </w:r>
+          </w:p>
+        </w:tc>
+      </w:tr>
+      <w:tr>
+        <w:trPr>
+          <w:cantSplit/>
+        </w:trPr>
+        <w:tc>
+          <w:tcPr>
+            <w:tcW w:type="dxa" w:w="4320"/>
+          </w:tcPr>
+          <w:p>
+            <w:r>
+              <w:rPr>
+                <w:sz w:val="18"/>
+              </w:rPr>
+              <w:t>Ошибка в пароле, невозможность самостоятельно восстановить вход</w:t>
+            </w:r>
+          </w:p>
+        </w:tc>
+        <w:tc>
+          <w:tcPr>
+            <w:tcW w:type="dxa" w:w="4320"/>
+          </w:tcPr>
+          <w:p>
+            <w:r>
+              <w:rPr>
+                <w:sz w:val="18"/>
+              </w:rPr>
+              <w:t>Два ввода при регистрации и смене пароля; отдельный глаз у каждого поля; восстановление по почте</w:t>
+            </w:r>
+          </w:p>
+        </w:tc>
+      </w:tr>
+      <w:tr>
+        <w:trPr>
+          <w:cantSplit/>
+        </w:trPr>
+        <w:tc>
+          <w:tcPr>
+            <w:tcW w:type="dxa" w:w="4320"/>
+          </w:tcPr>
+          <w:p>
+            <w:r>
+              <w:rPr>
+                <w:sz w:val="18"/>
+              </w:rPr>
+              <w:t>Неясно, создан ли аккаунт и отправлено ли письмо</w:t>
+            </w:r>
+          </w:p>
+        </w:tc>
+        <w:tc>
+          <w:tcPr>
+            <w:tcW w:type="dxa" w:w="4320"/>
+          </w:tcPr>
+          <w:p>
+            <w:r>
+              <w:rPr>
+                <w:sz w:val="18"/>
+              </w:rPr>
+              <w:t>Отдельный экран подтверждения, явные локальные ошибки, повторная отправка, сохранение полей при сетевой/SMTP-ошибке</w:t>
+            </w:r>
+          </w:p>
+        </w:tc>
+      </w:tr>
+      <w:tr>
+        <w:trPr>
+          <w:cantSplit/>
+        </w:trPr>
+        <w:tc>
+          <w:tcPr>
+            <w:tcW w:type="dxa" w:w="4320"/>
+          </w:tcPr>
+          <w:p>
+            <w:r>
+              <w:rPr>
+                <w:sz w:val="18"/>
+              </w:rPr>
+              <w:t>После подтверждения в той же вкладке оставалась форма отправки письма</w:t>
+            </w:r>
+          </w:p>
+        </w:tc>
+        <w:tc>
+          <w:tcPr>
+            <w:tcW w:type="dxa" w:w="4320"/>
+          </w:tcPr>
+          <w:p>
+            <w:r>
+              <w:rPr>
+                <w:sz w:val="18"/>
+              </w:rPr>
+              <w:t>Переключение на вход после успешного подтверждения</w:t>
+            </w:r>
+          </w:p>
+        </w:tc>
+      </w:tr>
+      <w:tr>
+        <w:trPr>
+          <w:cantSplit/>
+        </w:trPr>
+        <w:tc>
+          <w:tcPr>
+            <w:tcW w:type="dxa" w:w="4320"/>
+          </w:tcPr>
+          <w:p>
+            <w:r>
+              <w:rPr>
+                <w:sz w:val="18"/>
+              </w:rPr>
+              <w:t>Нельзя стереть начальный ноль в зарплате/оценке</w:t>
+            </w:r>
+          </w:p>
+        </w:tc>
+        <w:tc>
+          <w:tcPr>
+            <w:tcW w:type="dxa" w:w="4320"/>
+          </w:tcPr>
+          <w:p>
+            <w:r>
+              <w:rPr>
+                <w:sz w:val="18"/>
+              </w:rPr>
+              <w:t>Строковое состояние ввода, преобразование в число только для проверки и отправки</w:t>
+            </w:r>
+          </w:p>
+        </w:tc>
+      </w:tr>
+      <w:tr>
+        <w:trPr>
+          <w:cantSplit/>
+        </w:trPr>
+        <w:tc>
+          <w:tcPr>
+            <w:tcW w:type="dxa" w:w="4320"/>
+          </w:tcPr>
+          <w:p>
+            <w:r>
+              <w:rPr>
+                <w:sz w:val="18"/>
+              </w:rPr>
+              <w:t>Ошибка сохранения плохо заметна</w:t>
+            </w:r>
+          </w:p>
+        </w:tc>
+        <w:tc>
+          <w:tcPr>
+            <w:tcW w:type="dxa" w:w="4320"/>
+          </w:tcPr>
+          <w:p>
+            <w:r>
+              <w:rPr>
+                <w:sz w:val="18"/>
+              </w:rPr>
+              <w:t>Контрастный блок и роль alert</w:t>
+            </w:r>
+          </w:p>
+        </w:tc>
+      </w:tr>
+      <w:tr>
+        <w:trPr>
+          <w:cantSplit/>
+        </w:trPr>
+        <w:tc>
+          <w:tcPr>
+            <w:tcW w:type="dxa" w:w="4320"/>
+          </w:tcPr>
+          <w:p>
+            <w:r>
+              <w:rPr>
+                <w:sz w:val="18"/>
+              </w:rPr>
+              <w:t>На телефоне слова/кнопки/аватар тесно примыкают</w:t>
+            </w:r>
+          </w:p>
+        </w:tc>
+        <w:tc>
+          <w:tcPr>
+            <w:tcW w:type="dxa" w:w="4320"/>
+          </w:tcPr>
+          <w:p>
+            <w:r>
+              <w:rPr>
+                <w:sz w:val="18"/>
+              </w:rPr>
+              <w:t>Пробел в заголовке, gap и перенос элементов шапки/действий</w:t>
+            </w:r>
+          </w:p>
+        </w:tc>
+      </w:tr>
+      <w:tr>
+        <w:trPr>
+          <w:cantSplit/>
+        </w:trPr>
+        <w:tc>
+          <w:tcPr>
+            <w:tcW w:type="dxa" w:w="4320"/>
+          </w:tcPr>
+          <w:p>
+            <w:r>
+              <w:rPr>
+                <w:sz w:val="18"/>
+              </w:rPr>
+              <w:t>После отзыва в открытой карточке оставались контакты до F5</w:t>
+            </w:r>
+          </w:p>
+        </w:tc>
+        <w:tc>
+          <w:tcPr>
+            <w:tcW w:type="dxa" w:w="4320"/>
+          </w:tcPr>
+          <w:p>
+            <w:r>
+              <w:rPr>
+                <w:sz w:val="18"/>
+              </w:rPr>
+              <w:t>Обновление проекции приглашений каждые 15 секунд и при фокусе окна; сервер продолжает проверять доступ на каждый запрос</w:t>
+            </w:r>
+          </w:p>
+        </w:tc>
+      </w:tr>
+    </w:tbl>
+    <w:p>
+      <w:r>
+        <w:t>В исходнике до этого изменения уже была условная подпись значка для неподтверждённого грейда. Новая сборка проверена браузером: «к проверке», без ложного утверждения о подтверждении.</w:t>
+      </w:r>
+    </w:p>
+    <w:p>
+      <w:r>
+        <w:t>По прямой просьбе удалён один указанный аккаунт без деловой истории вместе с его профилем, согласиями и ссылкой подтверждения; второго указанного адреса в БД не было. Реальные адреса и секреты в этот отчёт не включены. После выкладки пользователь повторил проверку и сообщил: «всё идеально работает». Последняя просьба убрать рекомендацию менеджера паролей выполнена (c4bca3c), на сайте осталось «От 10 до 128 символов».</w:t>
+      </w:r>
+    </w:p>
+    <w:p>
+      <w:pPr>
+        <w:pStyle w:val="Heading2"/>
+      </w:pPr>
+      <w:r>
+        <w:t>Проверки и границы</w:t>
+      </w:r>
+    </w:p>
+    <w:p>
+      <w:r>
+        <w:t>- COOKIE_SECURE=false python3 scripts/run_local.py .venv/bin/pytest tests -q --tb=short: 119 passed, одно предупреждение зависимости Starlette/AnyIO, 37,13 с.</w:t>
+      </w:r>
+    </w:p>
+    <w:p>
+      <w:r>
+        <w:t>- npm --prefix apps/web run build: TypeScript и Vite успешны, 58 модулей.</w:t>
+      </w:r>
+    </w:p>
+    <w:p>
+      <w:r>
+        <w:t>- scripts/check_auth_browser.py: 8 проверок с настоящими API/PostgreSQL/Chromium и SMTP в памяти, без внешних писем. Обязательные поля, несовпадение, глаз, отказ SMTP с сохранением формы, подтверждение/вход, восстановление с телефона, аннулирование старого сеанса, отсутствие горизонтального переполнения. Ошибок JavaScript нет.</w:t>
+      </w:r>
+    </w:p>
+    <w:p>
+      <w:r>
+        <w:t>- После выкладки scripts/smoke_stage_a.py --out docs/delivery/evidence/human_followup_2026-10-21/live-smoke.json: 24 группы PASS, ошибок JavaScript нет. Включены реальное очищение нуля в зарплате и оценке, исчезновение отозванных контактов без F5, PDF/межфирменная изоляция, черновики при ошибке сети, тесты и подбор. SMTP в этом прогоне не используется.</w:t>
+      </w:r>
+    </w:p>
+    <w:p>
+      <w:r>
+        <w:t>- На публичном HTTPS отдельно открыта новая регистрация: оба поля и глаз доступны, пустая форма блокирует запрос. Сохранён live-registration.png.</w:t>
+      </w:r>
+    </w:p>
+    <w:p>
+      <w:r>
+        <w:t>- Развёрнуты api/web/task-worker проекта fsp-mvp; api/web/db/edge healthy, worker работает. В production миграция c6a10321d001, обоих указанных адресов нет. Перед миграцией сохранена приватная резервная копия БД, не включённая в Git.</w:t>
+      </w:r>
+    </w:p>
+    <w:p>
+      <w:r>
+        <w:t>- Миграция c6a10321d001: отдельная таблица хешей одноразовых ссылок. Срок 30 минут, общий ответ для неизвестного адреса, ограничение частоты, смена пароля завершает старые сеансы и гасит прежние ссылки. Ссылки подтверждения и смены пароля не взаимозаменяемы. Сбой SMTP откатывает транзакцию.</w:t>
+      </w:r>
+    </w:p>
+    <w:p>
+      <w:r>
+        <w:t>- Полный первоначальный запуск pytest без tests ошибочно захватил сторонние исходники в архиве; этот запуск не считается проверкой нашего проекта. Исправленный запуск ограничен собственной тестовой папкой.</w:t>
+      </w:r>
+    </w:p>
+    <w:p>
+      <w:r>
+        <w:t>- Исходники затронутых форм, API, схемы, миграции, SMTP и сессии прочитаны; прослежены UI → API → письмо → одноразовая ссылка → БД → вход, а также отзыв согласия → проекция карточки. Отрицательные сценарии проверены тестами. Полное повторное чтение стороннего архива не выполнялось и не заявляется.</w:t>
+      </w:r>
+    </w:p>
+    <w:p>
+      <w:r>
+        <w:t>Новая цепочка проверена с имитацией почты. Реальная доставка регистрационного письма ранее подтверждена пользователем для одного адреса; причина отсутствия письма на втором не установлена, записи аккаунта не было. После выкладки пользователь подтвердил общую работоспособность; отдельный протокол получения именно письма восстановления не приложен, поэтому он не объявляется самостоятельным измерением реальной доставки. Сообщение об отправке не гарантирует попадание письма во входящие.</w:t>
+      </w:r>
+    </w:p>
+    <w:p>
+      <w:r>
+        <w:t>Ручное обновление заданий — наблюдение удобства, не доказанный сбой планировщика: есть кнопка обновления и периодический опрос. Длительное календарное наблюдение и независимая оценка качества грейдов остаются за рамками этого прогона. Публикация GitHub отложена пользователем.</w:t>
+      </w:r>
+    </w:p>
+    <w:p>
+      <w:r>
+        <w:br w:type="page"/>
+      </w:r>
+    </w:p>
+    <w:p>
+      <w:r>
+        <w:t>&gt; Обновление после ручного прохода: актуальный прикладной код c4bca3c, результаты — 119 серверных тестов, 8 проверок регистрации/восстановления и 24 группы живого smoke. Текущий статус (CURRENT_STATUS_2026-10-21.md), ручная приёмка (HUMAN_ACCEPTANCE_2026-10-21.md). Ниже сохранён технический срез до этого прохода: числа 116/22 относятся к нему. Указания «человек ещё не проверил» описывают тот момент, а не текущий остаток.</w:t>
+      </w:r>
+    </w:p>
     <w:p>
       <w:pPr>
         <w:pStyle w:val="Heading1"/>
@@ -4366,7 +5519,7 @@
     </w:p>
     <w:p>
       <w:r>
-        <w:t>Отдельно test_mail.py проверяет TLS, ошибки авторизации/доставки/таймаута/конфигурации и полный rollback; test_api.py — просроченный/неверный токен. Это имитация ошибок SMTP, не испытание отказа реального провайдера. Повторная отправка подтверждения и восстановление пароля пока отсутствуют.</w:t>
+        <w:t>Отдельно test_mail.py проверяет TLS, ошибки авторизации/доставки/таймаута/конфигурации и полный rollback; test_api.py — просроченный/неверный токен. Это имитация ошибок SMTP, не испытание отказа реального провайдера. После этого прогона добавлены повторная отправка и восстановление: хеши одноразовых ссылок, срок 30 минут, минутное ограничение на аккаунт, аннулирование прежних сессий. test_account_recovery.py и 8 проверок браузера прошли; подробности в HUMAN_ACCEPTANCE_2026-10-21.md. Новые SMTP-отказы воспроизводились имитацией.</w:t>
       </w:r>
     </w:p>
     <w:p>
@@ -4440,12 +5593,12 @@
         <w:pStyle w:val="Heading1"/>
       </w:pPr>
       <w:r>
-        <w:t>Оставшиеся действия после финального аудита — 21 октября 2026</w:t>
+        <w:t>Остаток работ — после ручной приёмки 21 октября 2026</w:t>
       </w:r>
     </w:p>
     <w:p>
       <w:r>
-        <w:t>Этот документ — актуальный остаток, а не повтор выполненных B01–B09/Q1–Q6. Фактические исправления и доказательства (FINAL_AUDIT_2026-10-21.md). Пользователь попросил ручной проход в самом конце и отложил push до отдельного продолжения. Ниже различаются внешние действия, пределы доказательств и будущие идеи.</w:t>
+        <w:t>Сверка всего утреннего плана (CURRENT_STATUS_2026-10-21.md). Технические задачи Q1–Q7 и согласованные исправления ручного прохода выполнены. Документы актуализированы; это не означает выполнения публикации, внешней отправки или независимого исследования качества.</w:t>
       </w:r>
     </w:p>
     <w:p>
@@ -4453,52 +5606,37 @@
         <w:pStyle w:val="Heading2"/>
       </w:pPr>
       <w:r>
-        <w:t>1. Перед сдачей: ручная приёмка</w:t>
+        <w:t>1. Перед передачей</w:t>
       </w:r>
     </w:p>
     <w:p>
       <w:r>
-        <w:t>Команда, 25–40 минут; выполнить в самом конце. Протокол (HUMAN_VERIFY_PROTOCOL_STAGE_A.md) оставлен незаполненным. Пять подготовленных аккаунтов (REVIEW_ACCOUNTS_2026-10-21.md) проверены на вход; чистые Python и SQL Middle не проходили тестов. Пароли находятся только в приватном файле на сервере.</w:t>
+        <w:t>- Локальные README, changelog, маршрут жюри, API, техническая документация и итоговый отчёт обновлены под c4bca3c. Новую регистрацию пользователь оценил как работающую; фраза про менеджер паролей удалена.</w:t>
       </w:r>
     </w:p>
     <w:p>
       <w:r>
-        <w:t>- Внешнее устройство/сеть: HTTPS, вход, PDF.</w:t>
+        <w:t>- После разрешения на push опубликовать проверенную ветку, проверить удалённые ссылки и SHA. Пока публикация прямо отложена.</w:t>
       </w:r>
     </w:p>
     <w:p>
       <w:r>
-        <w:t>- Черновик, ошибка сохранения, отмена ухода и пропусков: предупреждения понятны без подсказки.</w:t>
+        <w:t>- Открыть именно предназначенные к отправке PDF/DOCX/слайды и пройти короткий маршрут FOR_JURY как независимый читатель. Основной функциональный проход уже был с сопровождением; время 10–15 минут без подсказок не измерено. Повторять всю техническую проверку без новых изменений не требуется.</w:t>
       </w:r>
     </w:p>
     <w:p>
       <w:r>
-        <w:t>- SQL Middle — отдельный data-кандидат, не общий подтверждённый Python-профиль.</w:t>
+        <w:t>- Явно принять границы доказательств для сдачи: синтетическая валидация, управляемое время вместо реального ожидания недели. Отдельное решение человека об этом не записано; его нельзя заменить зелёными автотестами.</w:t>
       </w:r>
     </w:p>
     <w:p>
       <w:r>
-        <w:t>- Быстрый маршрут: готовый кандидат → работодатель → подбор → приглашение → принятие → контакты → чат → задания → отзыв → другая компания.</w:t>
+        <w:t>- Отправить ссылки организаторам и зафиксировать подтверждение. Pck5 до этого открыт.</w:t>
       </w:r>
     </w:p>
     <w:p>
       <w:r>
-        <w:t>- На физическом телефоне: обнаружимость меню, клавиатура и видимость кнопок в приглашении; 360/390/768 в эмуляторе уже проверены.</w:t>
-      </w:r>
-    </w:p>
-    <w:p>
-      <w:r>
-        <w:t>- Удобство анонимных обозначений, объяснения балла, компактности формы и плотности текста U06; дополнительный обратный отсчёт не реализован, точная дата есть.</w:t>
-      </w:r>
-    </w:p>
-    <w:p>
-      <w:r>
-        <w:t>- Записать время, места остановок, FAIL/SKIP. Ошибки вернуть в адресный fix-loop. Не отмечать человеческий шаг пройденным по скриншотам автоматики.</w:t>
-      </w:r>
-    </w:p>
-    <w:p>
-      <w:r>
-        <w:t>Готово: все must имеют реальные отметки человека, дефекты устранены либо явно приняты как ограничения владельцем. Внутренняя приёмка не считается независимым бизнес-пилотом.</w:t>
+        <w:t>Протокол с фактическими отметками (HUMAN_VERIFY_PROTOCOL_STAGE_A.md) различает PASS, частичное человеческое покрытие и незафиксированные формальные шаги. Пилот с независимыми участниками не следует путать с ручной проверкой интерфейса.</w:t>
       </w:r>
     </w:p>
     <w:p>
@@ -4511,7 +5649,7 @@
     </w:p>
     <w:p>
       <w:r>
-        <w:t>Данила / участник с git-доступом. Существовавшие 25 локальных коммитов и новые коммиты сохранены, force-push не выполнялся. GitHub-коннектор авторизован, но git-транспорт сервера не авторизован; подмена истории одним снимком не выполнена. Пользователь распорядился публиковать позже.</w:t>
+        <w:t>Данила / участник с git-доступом. Локальная история сохранена, force-push не выполнялся. Ранее git-транспорт не имел авторизации; текущее состояние доступа здесь не перепроверялось; подмена истории одним снимком не выполнена. Пользователь распорядился публиковать позже.</w:t>
       </w:r>
     </w:p>
     <w:p>
@@ -5003,63 +6141,6 @@
               <w:rPr>
                 <w:sz w:val="18"/>
               </w:rPr>
-              <w:t>Повторное письмо и восстановление пароля</w:t>
-            </w:r>
-          </w:p>
-        </w:tc>
-        <w:tc>
-          <w:tcPr>
-            <w:tcW w:type="dxa" w:w="1875"/>
-          </w:tcPr>
-          <w:p>
-            <w:r>
-              <w:rPr>
-                <w:sz w:val="18"/>
-              </w:rPr>
-              <w:t>Восстановление доступа без ручного оператора</w:t>
-            </w:r>
-          </w:p>
-        </w:tc>
-        <w:tc>
-          <w:tcPr>
-            <w:tcW w:type="dxa" w:w="2215"/>
-          </w:tcPr>
-          <w:p>
-            <w:r>
-              <w:rPr>
-                <w:sz w:val="18"/>
-              </w:rPr>
-              <w:t>Одноразовые токены, срок, rate limit, отсутствие утечки существования аккаунта</w:t>
-            </w:r>
-          </w:p>
-        </w:tc>
-        <w:tc>
-          <w:tcPr>
-            <w:tcW w:type="dxa" w:w="2676"/>
-          </w:tcPr>
-          <w:p>
-            <w:r>
-              <w:rPr>
-                <w:sz w:val="18"/>
-              </w:rPr>
-              <w:t>Отдельная реализация; реальный SMTP уже работает</w:t>
-            </w:r>
-          </w:p>
-        </w:tc>
-      </w:tr>
-      <w:tr>
-        <w:trPr>
-          <w:cantSplit/>
-        </w:trPr>
-        <w:tc>
-          <w:tcPr>
-            <w:tcW w:type="dxa" w:w="1875"/>
-          </w:tcPr>
-          <w:p>
-            <w:r>
-              <w:rPr>
-                <w:sz w:val="18"/>
-              </w:rPr>
               <w:t>ATS</w:t>
             </w:r>
           </w:p>
@@ -5190,7 +6271,7 @@
     </w:p>
     <w:p>
       <w:r>
-        <w:t>Продолжительность финального выступления нужно подтвердить у организаторов. Ниже репетиционный маршрут; он не объявляется регламентом. Проверку человеком 25–40 минут провести отдельно до выступления.</w:t>
+        <w:t>Продолжительность финального выступления нужно подтвердить у организаторов. Ниже репетиционный маршрут; он не объявляется регламентом. Основной ручной маршрут уже пройден с сопровождением на ПК/Android. Самостоятельная репетиция питча с таймером остаётся отдельным действием.</w:t>
       </w:r>
     </w:p>
     <w:p>
@@ -5203,7 +6284,7 @@
     </w:p>
     <w:p>
       <w:r>
-        <w:t>1. Готовый кандидат: показать категорию, подтверждения навыков и отсутствие обязательного ФСП. Для демонстрации начала теста открыть отдельного fresh_python; показать восемь заданий, сохранение черновика и отмену завершения с пропусками. Не решать весь тест на сцене.</w:t>
+        <w:t>1. Готовый кандидат: показать категорию, подтверждения навыков и отсутствие обязательного ФСП. Для демонстрации начала теста открыть новый сценарный аккаунт с доступной попыткой (прежний fresh_python уже использован); показать восемь заданий, сохранение черновика и отмену завершения с пропусками. Не решать весь тест на сцене.</w:t>
       </w:r>
     </w:p>
     <w:p>
@@ -5266,7 +6347,7 @@
     </w:p>
     <w:p>
       <w:r>
-        <w:t>- Что проверили реально? 116 backend-тестов, 22 группы живого браузерного сценария, реальное письмо и вход, нагрузка и перезапуск. Числа проверки тестового банка — вычисления/симуляции, не люди.</w:t>
+        <w:t>- Что проверили реально? 119 backend-тестов, 8 проверок регистрации/восстановления с SMTP в памяти, 24 группы живого браузерного сценария, реальное письмо и вход, нагрузка и перезапуск. Числа проверки тестового банка — вычисления/симуляции, не люди.</w:t>
       </w:r>
     </w:p>
     <w:p>
@@ -5302,14 +6383,14 @@
         <w:pStyle w:val="Heading2"/>
       </w:pPr>
       <w:r>
-        <w:t>Предпросмотр компании и зарплаты</w:t>
+        <w:t>Регистрация после ручной приёмки</w:t>
       </w:r>
     </w:p>
     <w:p>
       <w:r>
         <w:drawing>
           <wp:inline xmlns:a="http://schemas.openxmlformats.org/drawingml/2006/main" xmlns:pic="http://schemas.openxmlformats.org/drawingml/2006/picture">
-            <wp:extent cx="5669280" cy="4153319"/>
+            <wp:extent cx="5656847" cy="5669280"/>
             <wp:docPr id="1" name="Picture 1"/>
             <wp:cNvGraphicFramePr>
               <a:graphicFrameLocks noChangeAspect="1"/>
@@ -5318,7 +6399,7 @@
               <a:graphicData uri="http://schemas.openxmlformats.org/drawingml/2006/picture">
                 <pic:pic>
                   <pic:nvPicPr>
-                    <pic:cNvPr id="0" name="invitation-salary.png"/>
+                    <pic:cNvPr id="0" name="live-registration.png"/>
                     <pic:cNvPicPr/>
                   </pic:nvPicPr>
                   <pic:blipFill>
@@ -5330,7 +6411,7 @@
                   <pic:spPr>
                     <a:xfrm>
                       <a:off x="0" y="0"/>
-                      <a:ext cx="5669280" cy="4153319"/>
+                      <a:ext cx="5656847" cy="5669280"/>
                     </a:xfrm>
                     <a:prstGeom prst="rect"/>
                   </pic:spPr>
@@ -5351,14 +6432,14 @@
         <w:pStyle w:val="Heading2"/>
       </w:pPr>
       <w:r>
-        <w:t>Приглашение на ширине 360 px</w:t>
+        <w:t>Восстановление пароля на ширине 390 px</w:t>
       </w:r>
     </w:p>
     <w:p>
       <w:r>
         <w:drawing>
           <wp:inline xmlns:a="http://schemas.openxmlformats.org/drawingml/2006/main" xmlns:pic="http://schemas.openxmlformats.org/drawingml/2006/picture">
-            <wp:extent cx="2758028" cy="5669280"/>
+            <wp:extent cx="1571442" cy="5669279"/>
             <wp:docPr id="2" name="Picture 2"/>
             <wp:cNvGraphicFramePr>
               <a:graphicFrameLocks noChangeAspect="1"/>
@@ -5367,7 +6448,7 @@
               <a:graphicData uri="http://schemas.openxmlformats.org/drawingml/2006/picture">
                 <pic:pic>
                   <pic:nvPicPr>
-                    <pic:cNvPr id="0" name="invitation-mobile.png"/>
+                    <pic:cNvPr id="0" name="mobile-password-reset.png"/>
                     <pic:cNvPicPr/>
                   </pic:nvPicPr>
                   <pic:blipFill>
@@ -5379,7 +6460,7 @@
                   <pic:spPr>
                     <a:xfrm>
                       <a:off x="0" y="0"/>
-                      <a:ext cx="2758028" cy="5669280"/>
+                      <a:ext cx="1571442" cy="5669279"/>
                     </a:xfrm>
                     <a:prstGeom prst="rect"/>
                   </pic:spPr>
@@ -5400,14 +6481,14 @@
         <w:pStyle w:val="Heading2"/>
       </w:pPr>
       <w:r>
-        <w:t>Мобильное меню на ширине 390 px</w:t>
+        <w:t>Кабинет на ширине 390 px</w:t>
       </w:r>
     </w:p>
     <w:p>
       <w:r>
         <w:drawing>
           <wp:inline xmlns:a="http://schemas.openxmlformats.org/drawingml/2006/main" xmlns:pic="http://schemas.openxmlformats.org/drawingml/2006/picture">
-            <wp:extent cx="2121899" cy="5669279"/>
+            <wp:extent cx="1458455" cy="5669276"/>
             <wp:docPr id="3" name="Picture 3"/>
             <wp:cNvGraphicFramePr>
               <a:graphicFrameLocks noChangeAspect="1"/>
@@ -5416,7 +6497,7 @@
               <a:graphicData uri="http://schemas.openxmlformats.org/drawingml/2006/picture">
                 <pic:pic>
                   <pic:nvPicPr>
-                    <pic:cNvPr id="0" name="mobile-390.png"/>
+                    <pic:cNvPr id="0" name="mobile-candidate.png"/>
                     <pic:cNvPicPr/>
                   </pic:nvPicPr>
                   <pic:blipFill>
@@ -5428,7 +6509,7 @@
                   <pic:spPr>
                     <a:xfrm>
                       <a:off x="0" y="0"/>
-                      <a:ext cx="2121899" cy="5669279"/>
+                      <a:ext cx="1458455" cy="5669276"/>
                     </a:xfrm>
                     <a:prstGeom prst="rect"/>
                   </pic:spPr>

</xml_diff>

<commit_message>
docs: consolidate main with concise README and complete deployment guides
</commit_message>
<xml_diff>
--- a/docs/delivery/FINAL_REPORT_2026-10-21.docx
+++ b/docs/delivery/FINAL_REPORT_2026-10-21.docx
@@ -12,12 +12,12 @@
     </w:p>
     <w:p>
       <w:r>
-        <w:t>Прикладная версия: c4bca3c (регистрация/восстановление — aaa7164). Ветка codex/fsp-mvp. Банк 2.1.1, подбор matching-1.2.0. Стенд: https://85-137-26-131.sslip.io/ . Этот документ описывает текущий итог; прежние протоколы сохраняют свои даты и результаты.</w:t>
+        <w:t>Прикладная версия: c4bca3c (регистрация/восстановление — aaa7164). Основная ветка main; приложение сохранено при объединении с исследовательской веткой V4. Банк 2.1.1, подбор matching-1.2.0. Стенд: https://85-137-26-131.sslip.io/ . Этот документ описывает текущий итог; прежние протоколы сохраняют свои даты и результаты.</w:t>
       </w:r>
     </w:p>
     <w:p>
       <w:r>
-        <w:t>Абсолютно весь исходный список не закрыт. Технические задачи Q1–Q7 и исправления, согласованные по ручному проходу, выполнены. Публикация актуальной истории отложена пользователем, ссылки организаторам не отправлены. Независимый пилот качества грейдов/подбора не проводился. Это разные виды завершения, их нельзя объединять в «100%».</w:t>
+        <w:t>Согласованный технический объём хакатона выполнен. Q1–Q7 и исправления ручного прохода завершены. По решению пользователя код и документация объединены в main. Пилот с людьми и автономное развёртывание отложены за рамки текущей сдачи; отсутствие пилота остаётся ограничением доказательств. Отправка материалов организаторам — отдельное действие команды.</w:t>
       </w:r>
     </w:p>
     <w:p>
@@ -468,7 +468,7 @@
               <w:rPr>
                 <w:sz w:val="18"/>
               </w:rPr>
-              <w:t>Локальный комплект готов; частично до публикации</w:t>
+              <w:t>Комплект подготовлен в main</w:t>
             </w:r>
           </w:p>
         </w:tc>
@@ -481,7 +481,7 @@
               <w:rPr>
                 <w:sz w:val="18"/>
               </w:rPr>
-              <w:t>Актуальные GitHub-ссылки и самостоятельный маршрут жюри после публикации ещё не подтверждены</w:t>
+              <w:t>Короткий README, подробные руководства и маршрут жюри; техническая проверка объединения — в отчёте (../REPOSITORY.md). Самостоятельный проход с таймером не заявляется</w:t>
             </w:r>
           </w:p>
         </w:tc>
@@ -613,7 +613,7 @@
               <w:rPr>
                 <w:sz w:val="18"/>
               </w:rPr>
-              <w:t>Только после разрешения на публикацию и проверки ссылок; внешних сообщений агент не отправлял</w:t>
+              <w:t>Отправка ссылок организаторам не подтверждена; внешних сообщений агент не отправлял</w:t>
             </w:r>
           </w:p>
         </w:tc>
@@ -734,7 +734,7 @@
     </w:p>
     <w:p>
       <w:r>
-        <w:t>Единый TODO (REMAINING_AFTER_FINAL_AUDIT_2026-10-21.md). До разрешения пользователя push не выполнять. В этой синхронизации документов приложение и данные не менялись; новые прогоны функциональных тестов не заявляются.</w:t>
+        <w:t>Единый TODO (REMAINING_AFTER_FINAL_AUDIT_2026-10-21.md). Объединение веток и новый технический прогон описаны отдельно в истории репозитория (../REPOSITORY.md). Прежние результаты ниже сохраняют свою дату и объём.</w:t>
       </w:r>
     </w:p>
     <w:p>
@@ -1142,7 +1142,7 @@
     </w:p>
     <w:p>
       <w:r>
-        <w:t>Ручное обновление заданий — наблюдение удобства, не доказанный сбой планировщика: есть кнопка обновления и периодический опрос. Длительное календарное наблюдение и независимая оценка качества грейдов остаются за рамками этого прогона. Публикация GitHub отложена пользователем.</w:t>
+        <w:t>Ручное обновление заданий — наблюдение удобства, не доказанный сбой планировщика: есть кнопка обновления и периодический опрос. Длительное календарное наблюдение и независимая оценка качества грейдов остаются за рамками этого прогона. На момент этого ручного прогона публикация была отложена. Последующим решением владелец разрешил публикацию и объединение в main; см. текущий статус (CURRENT_STATUS_2026-10-21.md).</w:t>
       </w:r>
     </w:p>
     <w:p>
@@ -5593,12 +5593,12 @@
         <w:pStyle w:val="Heading1"/>
       </w:pPr>
       <w:r>
-        <w:t>Остаток работ — после ручной приёмки 21 октября 2026</w:t>
+        <w:t>После хакатона и перед отправкой</w:t>
       </w:r>
     </w:p>
     <w:p>
       <w:r>
-        <w:t>Сверка всего утреннего плана (CURRENT_STATUS_2026-10-21.md). Технические задачи Q1–Q7 и согласованные исправления ручного прохода выполнены. Документы актуализированы; это не означает выполнения публикации, внешней отправки или независимого исследования качества.</w:t>
+        <w:t>Текущий статус (CURRENT_STATUS_2026-10-21.md). Согласованный технический объём хакатона и исправления ручного прохода выполнены. Код и документация собраны в main; подробности объединения и проверки (../REPOSITORY.md).</w:t>
       </w:r>
     </w:p>
     <w:p>
@@ -5606,37 +5606,22 @@
         <w:pStyle w:val="Heading2"/>
       </w:pPr>
       <w:r>
-        <w:t>1. Перед передачей</w:t>
+        <w:t>Передача материалов</w:t>
       </w:r>
     </w:p>
     <w:p>
       <w:r>
-        <w:t>- Локальные README, changelog, маршрут жюри, API, техническая документация и итоговый отчёт обновлены под c4bca3c. Новую регистрацию пользователь оценил как работающую; фраза про менеджер паролей удалена.</w:t>
+        <w:t>Команде остаётся отправить ссылки (SUBMISSION_LINKS.md) организаторам и провести репетицию по действующему регламенту. Факт отправки и выступления агент не подтверждает. Сценарий и ответы для питча (FINAL_DEMO_AND_PITCH_2026-10-21.md) подготовлены.</w:t>
       </w:r>
     </w:p>
     <w:p>
       <w:r>
-        <w:t>- После разрешения на push опубликовать проверенную ветку, проверить удалённые ссылки и SHA. Пока публикация прямо отложена.</w:t>
+        <w:t>По решению пользователя независимый пилот на людях не требуется для завершения этой работы. Самостоятельный проход жюри с таймером не заявляется выполненным и не блокирует техническую сдачу. Автономный комплект для закрытого контура также отложен.</w:t>
       </w:r>
     </w:p>
     <w:p>
       <w:r>
-        <w:t>- Открыть именно предназначенные к отправке PDF/DOCX/слайды и пройти короткий маршрут FOR_JURY как независимый читатель. Основной функциональный проход уже был с сопровождением; время 10–15 минут без подсказок не измерено. Повторять всю техническую проверку без новых изменений не требуется.</w:t>
-      </w:r>
-    </w:p>
-    <w:p>
-      <w:r>
-        <w:t>- Явно принять границы доказательств для сдачи: синтетическая валидация, управляемое время вместо реального ожидания недели. Отдельное решение человека об этом не записано; его нельзя заменить зелёными автотестами.</w:t>
-      </w:r>
-    </w:p>
-    <w:p>
-      <w:r>
-        <w:t>- Отправить ссылки организаторам и зафиксировать подтверждение. Pck5 до этого открыт.</w:t>
-      </w:r>
-    </w:p>
-    <w:p>
-      <w:r>
-        <w:t>Протокол с фактическими отметками (HUMAN_VERIFY_PROTOCOL_STAGE_A.md) различает PASS, частичное человеческое покрытие и незафиксированные формальные шаги. Пилот с независимыми участниками не следует путать с ручной проверкой интерфейса.</w:t>
+        <w:t>Ниже сохранены направления развития и ограничения для последующей работы. Они не означают, что перечисленные функции нужно успеть реализовать к хакатону.</w:t>
       </w:r>
     </w:p>
     <w:p>
@@ -5644,48 +5629,7 @@
         <w:pStyle w:val="Heading2"/>
       </w:pPr>
       <w:r>
-        <w:t>2. Публикация — отложена пользователем</w:t>
-      </w:r>
-    </w:p>
-    <w:p>
-      <w:r>
-        <w:t>Данила / участник с git-доступом. Локальная история сохранена, force-push не выполнялся. Ранее git-транспорт не имел авторизации; текущее состояние доступа здесь не перепроверялось; подмена истории одним снимком не выполнена. Пользователь распорядился публиковать позже.</w:t>
-      </w:r>
-    </w:p>
-    <w:p>
-      <w:r>
-        <w:t>После разрешения продолжить: настроить SSH deploy key с записью либо git/gh credential helper на сервере; секреты не отправлять в чат. Выполнить git fetch origin, проверить расхождение и новые чужие коммиты, затем обычный git push origin codex/fsp-mvp. Если требуется интеграция — сохранить WIP и проверить объединённую версию. Проверить удалённый SHA и открываемость DOCX/PDF/слайдов. Не мерджить в main без отдельного решения.</w:t>
-      </w:r>
-    </w:p>
-    <w:p>
-      <w:r>
-        <w:t>Новый резервный bundle можно перенести на авторизованную машину; он не является push. Для каждого bundle проверять git bundle list-heads и verify: старый Stage A содержит только HEAD на 889ebf3 и требует 2e6d6da. Более поздние изменения туда не входят.</w:t>
-      </w:r>
-    </w:p>
-    <w:p>
-      <w:pPr>
-        <w:pStyle w:val="Heading2"/>
-      </w:pPr>
-      <w:r>
-        <w:t>3. Фактическая передача организаторам и питч</w:t>
-      </w:r>
-    </w:p>
-    <w:p>
-      <w:r>
-        <w:t>Уполномоченный участник. Pck5 остаётся незакрытым до факта отправки. После публикации и приёмки отправить актуальные ссылки и зафиксировать дату, канал и подтверждение. Агент ничего организаторам не отправлял.</w:t>
-      </w:r>
-    </w:p>
-    <w:p>
-      <w:r>
-        <w:t>Обновлённая презентация сохранена отдельной копией; оригинал не перезаписан. Перед выступлением сверить действующий регламент длительности/формата (он не подтверждён в этой сессии), провести репетицию с таймером. Не путать семиминутную встречу с бизнесом со временем финального питча. Подготовленный сценарий и ответы: FINAL_DEMO_AND_PITCH_2026-10-21.md (FINAL_DEMO_AND_PITCH_2026-10-21.md).</w:t>
-      </w:r>
-    </w:p>
-    <w:p>
-      <w:pPr>
-        <w:pStyle w:val="Heading2"/>
-      </w:pPr>
-      <w:r>
-        <w:t>4. M02: реальные основания для грейдов</w:t>
+        <w:t>Исследования после хакатона: основания для грейдов</w:t>
       </w:r>
     </w:p>
     <w:p>
@@ -5708,7 +5652,7 @@
         <w:pStyle w:val="Heading2"/>
       </w:pPr>
       <w:r>
-        <w:t>5. M01: качество на реальных запросах</w:t>
+        <w:t>M01: качество на реальных запросах</w:t>
       </w:r>
     </w:p>
     <w:p>
@@ -5726,7 +5670,7 @@
         <w:pStyle w:val="Heading2"/>
       </w:pPr>
       <w:r>
-        <w:t>6. Производительность и эксплуатационные ограничения</w:t>
+        <w:t>Производительность и эксплуатационные ограничения</w:t>
       </w:r>
     </w:p>
     <w:p>
@@ -5756,7 +5700,7 @@
     </w:p>
     <w:p>
       <w:r>
-        <w:t>- Длительное календарное наблюдение 7/24/90 дней не проводилось. Команде принять достаточность управляемого времени для сдачи либо назначить наблюдение; реальное ожидание недели не изображать выполненным.</w:t>
+        <w:t>- Длительное календарное наблюдение 7/24/90 дней не проводилось. Для хакатона сохранены проверки управляемым временем; реальное ожидание недели не заявляется.</w:t>
       </w:r>
     </w:p>
     <w:p>
@@ -5769,7 +5713,7 @@
         <w:pStyle w:val="Heading2"/>
       </w:pPr>
       <w:r>
-        <w:t>7. Будущие идеи — сохранены, не выданы за обязательные дефекты</w:t>
+        <w:t>Будущие идеи — сохранены, не выданы за обязательные дефекты</w:t>
       </w:r>
     </w:p>
     <w:tbl>
@@ -6248,7 +6192,7 @@
         <w:pStyle w:val="Heading2"/>
       </w:pPr>
       <w:r>
-        <w:t>8. Что не нужно делать повторно без новых оснований</w:t>
+        <w:t>Что не нужно делать повторно без новых оснований</w:t>
       </w:r>
     </w:p>
     <w:p>

</xml_diff>